<commit_message>
PDF: landscape + shrunk wide tables; drop stray HTML-object artifacts
- Wide tables (Annex A, Tables 1 & 2) render in landscape with reduced font in
  PDF (pdflscape), so columns no longer collide or hyphenate; Word renders them
  portrait (LaTeX ignored), HTML stays interactive.
- Move itables init_notebook_mode into an HTML-only chunk so its injected HTML
  no longer leaks into PDF/Word as "<IPython.core.display.HTML object>".
- Widen the Domain column of the §3 definitions table (was hyphenating in PDF).
- Republish report.html/.docx/.pdf under docs/.

Co-Authored-By: Claude Opus 4.8 (1M context) <noreply@anthropic.com>
</commit_message>
<xml_diff>
--- a/docs/report.docx
+++ b/docs/report.docx
@@ -54,28 +54,6 @@
     </w:sdt>
     <w:p>
       <w:pPr>
-        <w:pStyle w:val="SourceCode"/>
-      </w:pPr>
-      <w:r>
-        <w:rPr>
-          <w:rStyle w:val="VerbatimChar"/>
-        </w:rPr>
-        <w:t xml:space="preserve">&lt;IPython.core.display.HTML object&gt;</w:t>
-      </w:r>
-    </w:p>
-    <w:p>
-      <w:pPr>
-        <w:pStyle w:val="SourceCode"/>
-      </w:pPr>
-      <w:r>
-        <w:rPr>
-          <w:rStyle w:val="VerbatimChar"/>
-        </w:rPr>
-        <w:t xml:space="preserve">&lt;IPython.core.display.HTML object&gt;</w:t>
-      </w:r>
-    </w:p>
-    <w:p>
-      <w:pPr>
         <w:pStyle w:val="FirstParagraph"/>
       </w:pPr>
       <w:r>
@@ -1602,8 +1580,8 @@
         <w:tblLook w:firstRow="1" w:lastRow="0" w:firstColumn="0" w:lastColumn="0" w:noHBand="0" w:noVBand="0" w:val="0020"/>
       </w:tblPr>
       <w:tblGrid>
-        <w:gridCol w:w="880"/>
-        <w:gridCol w:w="7040"/>
+        <w:gridCol w:w="2178"/>
+        <w:gridCol w:w="5742"/>
       </w:tblGrid>
       <w:tr>
         <w:trPr>

</xml_diff>

<commit_message>
Word landscape table sections; feedback form → GitHub issues pathway
- Wide tables (Tables 1, 2, Annex A) now sit in landscape sections in Word too
  (raw OpenXML sectPr breaks; PDF keeps LaTeX landscape, HTML unaffected), so
  columns get the full page width instead of cramming in portrait.
- Feedback: switch the primary path to a Microsoft Form (no GitHub account
  needed) whose responses are filed automatically as GitHub issues via Power
  Automate. Add FEEDBACK.md documenting the form fields, the Form→issue flow,
  and an alternative; wire a configurable FEEDBACK_FORM_URL into the report
  (GitHub issue links kept as a secondary path for technical contributors).

Co-Authored-By: Claude Opus 4.8 (1M context) <noreply@anthropic.com>
</commit_message>
<xml_diff>
--- a/docs/report.docx
+++ b/docs/report.docx
@@ -5172,6 +5172,14 @@
         <w:t xml:space="preserve">Table 1 — Strategic nominations: each centre’s top-ranked assets (sortable / filterable in HTML; asset names link to the data source).</w:t>
       </w:r>
     </w:p>
+    <w:p>
+      <w:pPr>
+        <w:sectPr>
+          <w:type w:val="nextPage"/>
+          <w:pgSz w:w="12240" w:h="15840"/>
+        </w:sectPr>
+      </w:pPr>
+    </w:p>
     <w:tbl>
       <w:tblPr>
         <w:tblStyle w:val="Table"/>
@@ -8021,6 +8029,14 @@
         </w:tc>
       </w:tr>
     </w:tbl>
+    <w:p>
+      <w:pPr>
+        <w:sectPr>
+          <w:pgSz w:w="15840" w:h="12240" w:orient="landscape"/>
+          <w:pgMar w:top="720" w:bottom="720" w:left="720" w:right="720"/>
+        </w:sectPr>
+      </w:pPr>
+    </w:p>
     <w:bookmarkEnd w:id="55"/>
     <w:bookmarkStart w:id="59" w:name="sec-6-3"/>
     <w:p>
@@ -8526,6 +8542,14 @@
         <w:t xml:space="preserve">shortlist: Open-access, high-readiness assets (sortable / filterable in HTML; asset names link to the data source).</w:t>
       </w:r>
     </w:p>
+    <w:p>
+      <w:pPr>
+        <w:sectPr>
+          <w:type w:val="nextPage"/>
+          <w:pgSz w:w="12240" w:h="15840"/>
+        </w:sectPr>
+      </w:pPr>
+    </w:p>
     <w:tbl>
       <w:tblPr>
         <w:tblStyle w:val="Table"/>
@@ -11465,6 +11489,14 @@
         </w:tc>
       </w:tr>
     </w:tbl>
+    <w:p>
+      <w:pPr>
+        <w:sectPr>
+          <w:pgSz w:w="15840" w:h="12240" w:orient="landscape"/>
+          <w:pgMar w:top="720" w:bottom="720" w:left="720" w:right="720"/>
+        </w:sectPr>
+      </w:pPr>
+    </w:p>
     <w:bookmarkEnd w:id="64"/>
     <w:bookmarkStart w:id="76" w:name="sec-6-6"/>
     <w:p>
@@ -13681,7 +13713,7 @@
       </w:r>
     </w:p>
     <w:bookmarkEnd w:id="85"/>
-    <w:bookmarkStart w:id="98" w:name="data-access-feedback-and-reproducibility"/>
+    <w:bookmarkStart w:id="99" w:name="data-access-feedback-and-reproducibility"/>
     <w:p>
       <w:pPr>
         <w:pStyle w:val="Heading2"/>
@@ -14056,7 +14088,7 @@
         <w:t xml:space="preserve"># or: --to docx</w:t>
       </w:r>
     </w:p>
-    <w:bookmarkStart w:id="97" w:name="X981c30afc5d34005fa58438231531a13ce51028"/>
+    <w:bookmarkStart w:id="98" w:name="X981c30afc5d34005fa58438231531a13ce51028"/>
     <w:p>
       <w:pPr>
         <w:pStyle w:val="Heading3"/>
@@ -14070,82 +14102,89 @@
         <w:pStyle w:val="FirstParagraph"/>
       </w:pPr>
       <w:r>
-        <w:t xml:space="preserve">Spotted an error, or know of an asset that should be included? Please open a short issue — it goes straight to the team and is tracked to resolution. The links below open a pre-filled template:</w:t>
+        <w:t xml:space="preserve">Spotted an error, or know of an asset that should be included? We want to hear it.</w:t>
+      </w:r>
+      <w:r>
+        <w:t xml:space="preserve"> </w:t>
+      </w:r>
+      <w:r>
+        <w:rPr>
+          <w:b/>
+          <w:bCs/>
+        </w:rPr>
+        <w:t xml:space="preserve">No GitHub account is needed</w:t>
+      </w:r>
+      <w:r>
+        <w:t xml:space="preserve"> </w:t>
+      </w:r>
+      <w:r>
+        <w:t xml:space="preserve">— use the feedback form; responses are routed automatically into the project’s GitHub issue tracker so every item is triaged and resolved (pipeline documented in</w:t>
+      </w:r>
+      <w:r>
+        <w:t xml:space="preserve"> </w:t>
+      </w:r>
+      <w:hyperlink r:id="rId94">
+        <w:r>
+          <w:rPr>
+            <w:rStyle w:val="VerbatimChar"/>
+          </w:rPr>
+          <w:t xml:space="preserve">FEEDBACK.md</w:t>
+        </w:r>
+      </w:hyperlink>
+      <w:r>
+        <w:t xml:space="preserve">).</w:t>
       </w:r>
     </w:p>
     <w:p>
       <w:pPr>
-        <w:pStyle w:val="Compact"/>
-        <w:numPr>
-          <w:ilvl w:val="0"/>
-          <w:numId w:val="1011"/>
-        </w:numPr>
+        <w:pStyle w:val="BlockText"/>
       </w:pPr>
+      <w:r>
+        <w:t xml:space="preserve">📝</w:t>
+      </w:r>
+      <w:r>
+        <w:t xml:space="preserve"> </w:t>
+      </w:r>
+      <w:r>
+        <w:rPr>
+          <w:b/>
+          <w:bCs/>
+        </w:rPr>
+        <w:t xml:space="preserve">Feedback form:</w:t>
+      </w:r>
+      <w:r>
+        <w:t xml:space="preserve"> </w:t>
+      </w:r>
+      <w:r>
+        <w:rPr>
+          <w:i/>
+          <w:iCs/>
+        </w:rPr>
+        <w:t xml:space="preserve">(link to be added once the Microsoft Form is published — see</w:t>
+      </w:r>
+      <w:r>
+        <w:rPr>
+          <w:i/>
+          <w:iCs/>
+        </w:rPr>
+        <w:t xml:space="preserve"> </w:t>
+      </w:r>
       <w:hyperlink r:id="rId94">
         <w:r>
           <w:rPr>
-            <w:rStyle w:val="Hyperlink"/>
-            <w:b/>
-            <w:bCs/>
+            <w:rStyle w:val="VerbatimChar"/>
+            <w:i/>
+            <w:iCs/>
           </w:rPr>
-          <w:t xml:space="preserve">Correct an asset record</w:t>
+          <w:t xml:space="preserve">FEEDBACK.md</w:t>
         </w:r>
       </w:hyperlink>
       <w:r>
-        <w:t xml:space="preserve"> </w:t>
-      </w:r>
-      <w:r>
-        <w:t xml:space="preserve">— wrong domain, access, contact, etc.</w:t>
-      </w:r>
-    </w:p>
-    <w:p>
-      <w:pPr>
-        <w:pStyle w:val="Compact"/>
-        <w:numPr>
-          <w:ilvl w:val="0"/>
-          <w:numId w:val="1011"/>
-        </w:numPr>
-      </w:pPr>
-      <w:hyperlink r:id="rId95">
-        <w:r>
-          <w:rPr>
-            <w:rStyle w:val="Hyperlink"/>
-            <w:b/>
-            <w:bCs/>
-          </w:rPr>
-          <w:t xml:space="preserve">Suggest a missing asset</w:t>
-        </w:r>
-      </w:hyperlink>
-      <w:r>
-        <w:t xml:space="preserve"> </w:t>
-      </w:r>
-      <w:r>
-        <w:t xml:space="preserve">— e.g. from a centre not yet represented.</w:t>
-      </w:r>
-    </w:p>
-    <w:p>
-      <w:pPr>
-        <w:pStyle w:val="Compact"/>
-        <w:numPr>
-          <w:ilvl w:val="0"/>
-          <w:numId w:val="1011"/>
-        </w:numPr>
-      </w:pPr>
-      <w:hyperlink r:id="rId96">
-        <w:r>
-          <w:rPr>
-            <w:rStyle w:val="Hyperlink"/>
-            <w:b/>
-            <w:bCs/>
-          </w:rPr>
-          <w:t xml:space="preserve">General feedback on the report</w:t>
-        </w:r>
-      </w:hyperlink>
-      <w:r>
-        <w:t xml:space="preserve"> </w:t>
-      </w:r>
-      <w:r>
-        <w:t xml:space="preserve">— on framing, figures, or analysis.</w:t>
+        <w:rPr>
+          <w:i/>
+          <w:iCs/>
+        </w:rPr>
+        <w:t xml:space="preserve">).</w:t>
       </w:r>
     </w:p>
     <w:p>
@@ -14153,11 +14192,49 @@
         <w:pStyle w:val="FirstParagraph"/>
       </w:pPr>
       <w:r>
-        <w:rPr>
-          <w:i/>
-          <w:iCs/>
-        </w:rPr>
-        <w:t xml:space="preserve">(Opening an issue requires a free GitHub account. For richer inline discussion the repository can later enable GitHub Discussions with a Giscus comment box; issue links are used here because they produce tracked, actionable items.)</w:t>
+        <w:t xml:space="preserve">If you do use GitHub, you can instead open a pre-filled issue directly:</w:t>
+      </w:r>
+      <w:r>
+        <w:t xml:space="preserve"> </w:t>
+      </w:r>
+      <w:hyperlink r:id="rId95">
+        <w:r>
+          <w:rPr>
+            <w:rStyle w:val="Hyperlink"/>
+          </w:rPr>
+          <w:t xml:space="preserve">correct a record</w:t>
+        </w:r>
+      </w:hyperlink>
+      <w:r>
+        <w:t xml:space="preserve">,</w:t>
+      </w:r>
+      <w:r>
+        <w:t xml:space="preserve"> </w:t>
+      </w:r>
+      <w:hyperlink r:id="rId96">
+        <w:r>
+          <w:rPr>
+            <w:rStyle w:val="Hyperlink"/>
+          </w:rPr>
+          <w:t xml:space="preserve">suggest a missing asset</w:t>
+        </w:r>
+      </w:hyperlink>
+      <w:r>
+        <w:t xml:space="preserve">, or</w:t>
+      </w:r>
+      <w:r>
+        <w:t xml:space="preserve"> </w:t>
+      </w:r>
+      <w:hyperlink r:id="rId97">
+        <w:r>
+          <w:rPr>
+            <w:rStyle w:val="Hyperlink"/>
+          </w:rPr>
+          <w:t xml:space="preserve">general feedback</w:t>
+        </w:r>
+      </w:hyperlink>
+      <w:r>
+        <w:t xml:space="preserve">.</w:t>
       </w:r>
     </w:p>
     <w:p>
@@ -14167,9 +14244,9 @@
         </w:pict>
       </w:r>
     </w:p>
-    <w:bookmarkEnd w:id="97"/>
     <w:bookmarkEnd w:id="98"/>
-    <w:bookmarkStart w:id="99" w:name="annex-a"/>
+    <w:bookmarkEnd w:id="99"/>
+    <w:bookmarkStart w:id="100" w:name="annex-a"/>
     <w:p>
       <w:pPr>
         <w:pStyle w:val="Heading2"/>
@@ -14189,6 +14266,14 @@
         </w:rPr>
         <w:t xml:space="preserve">All 123 catalogued assets, sortable and filterable in the HTML edition. Use the search box to find a centre, domain, or asset.</w:t>
       </w:r>
+    </w:p>
+    <w:p>
+      <w:pPr>
+        <w:sectPr>
+          <w:type w:val="nextPage"/>
+          <w:pgSz w:w="12240" w:h="15840"/>
+        </w:sectPr>
+      </w:pPr>
     </w:p>
     <w:tbl>
       <w:tblPr>
@@ -27844,14 +27929,22 @@
       </w:tr>
     </w:tbl>
     <w:p>
+      <w:pPr>
+        <w:sectPr>
+          <w:pgSz w:w="15840" w:h="12240" w:orient="landscape"/>
+          <w:pgMar w:top="720" w:bottom="720" w:left="720" w:right="720"/>
+        </w:sectPr>
+      </w:pPr>
+    </w:p>
+    <w:p>
       <w:r>
         <w:pict>
           <v:rect style="width:0;height:1.5pt" o:hralign="center" o:hrstd="t" o:hr="t"/>
         </w:pict>
       </w:r>
     </w:p>
-    <w:bookmarkEnd w:id="99"/>
-    <w:bookmarkStart w:id="100" w:name="annex-b"/>
+    <w:bookmarkEnd w:id="100"/>
+    <w:bookmarkStart w:id="101" w:name="annex-b"/>
     <w:p>
       <w:pPr>
         <w:pStyle w:val="Heading2"/>
@@ -28435,8 +28528,8 @@
         </w:pict>
       </w:r>
     </w:p>
-    <w:bookmarkEnd w:id="100"/>
-    <w:bookmarkStart w:id="103" w:name="annex-c"/>
+    <w:bookmarkEnd w:id="101"/>
+    <w:bookmarkStart w:id="104" w:name="annex-c"/>
     <w:p>
       <w:pPr>
         <w:pStyle w:val="Heading2"/>
@@ -28445,7 +28538,7 @@
         <w:t xml:space="preserve">Annex C — Merge log</w:t>
       </w:r>
     </w:p>
-    <w:bookmarkStart w:id="101" w:name="c.1-applied-consolidations"/>
+    <w:bookmarkStart w:id="102" w:name="c.1-applied-consolidations"/>
     <w:p>
       <w:pPr>
         <w:pStyle w:val="Heading3"/>
@@ -28757,8 +28850,8 @@
         </w:tc>
       </w:tr>
     </w:tbl>
-    <w:bookmarkEnd w:id="101"/>
-    <w:bookmarkStart w:id="102" w:name="c.2-recommended-for-catalogue"/>
+    <w:bookmarkEnd w:id="102"/>
+    <w:bookmarkStart w:id="103" w:name="c.2-recommended-for-catalogue"/>
     <w:p>
       <w:pPr>
         <w:pStyle w:val="Heading3"/>
@@ -28780,7 +28873,7 @@
         <w:pStyle w:val="Compact"/>
         <w:numPr>
           <w:ilvl w:val="0"/>
-          <w:numId w:val="1012"/>
+          <w:numId w:val="1011"/>
         </w:numPr>
       </w:pPr>
       <w:r>
@@ -28799,7 +28892,7 @@
         <w:pStyle w:val="Compact"/>
         <w:numPr>
           <w:ilvl w:val="0"/>
-          <w:numId w:val="1012"/>
+          <w:numId w:val="1011"/>
         </w:numPr>
       </w:pPr>
       <w:r>
@@ -28837,8 +28930,8 @@
         <w:t xml:space="preserve">are static and temporal versions of the same product — consider one catalogue record (2 → 1)</w:t>
       </w:r>
     </w:p>
-    <w:bookmarkEnd w:id="102"/>
     <w:bookmarkEnd w:id="103"/>
+    <w:bookmarkEnd w:id="104"/>
     <w:sectPr>
       <w:footnotePr>
         <w:numRestart w:val="eachSect"/>
@@ -29225,9 +29318,6 @@
     <w:abstractNumId w:val="991"/>
   </w:num>
   <w:num w:numId="1011">
-    <w:abstractNumId w:val="991"/>
-  </w:num>
-  <w:num w:numId="1012">
     <w:abstractNumId w:val="991"/>
   </w:num>
 </w:numbering>

</xml_diff>

<commit_message>
report: wire live Microsoft feedback form URL
Set FEEDBACK_FORM_URL to the published form (forms.office.com/e/ggzDBUqymB)
and re-render HTML/Word/PDF. The Feedback section now shows the live
"Give feedback" form button (no login) across all three formats; responses
can be auto-filed as GitHub issues via the Power Automate flow in FEEDBACK.md.

Co-Authored-By: Claude Opus 4.8 (1M context) <noreply@anthropic.com>
</commit_message>
<xml_diff>
--- a/docs/report.docx
+++ b/docs/report.docx
@@ -13713,7 +13713,7 @@
       </w:r>
     </w:p>
     <w:bookmarkEnd w:id="85"/>
-    <w:bookmarkStart w:id="99" w:name="data-access-feedback-and-reproducibility"/>
+    <w:bookmarkStart w:id="100" w:name="data-access-feedback-and-reproducibility"/>
     <w:p>
       <w:pPr>
         <w:pStyle w:val="Heading2"/>
@@ -14088,7 +14088,7 @@
         <w:t xml:space="preserve"># or: --to docx</w:t>
       </w:r>
     </w:p>
-    <w:bookmarkStart w:id="98" w:name="X981c30afc5d34005fa58438231531a13ce51028"/>
+    <w:bookmarkStart w:id="99" w:name="X981c30afc5d34005fa58438231531a13ce51028"/>
     <w:p>
       <w:pPr>
         <w:pStyle w:val="Heading3"/>
@@ -14145,46 +14145,21 @@
       <w:r>
         <w:t xml:space="preserve"> </w:t>
       </w:r>
-      <w:r>
-        <w:rPr>
-          <w:b/>
-          <w:bCs/>
-        </w:rPr>
-        <w:t xml:space="preserve">Feedback form:</w:t>
-      </w:r>
-      <w:r>
-        <w:t xml:space="preserve"> </w:t>
-      </w:r>
-      <w:r>
-        <w:rPr>
-          <w:i/>
-          <w:iCs/>
-        </w:rPr>
-        <w:t xml:space="preserve">(link to be added once the Microsoft Form is published — see</w:t>
-      </w:r>
-      <w:r>
-        <w:rPr>
-          <w:i/>
-          <w:iCs/>
-        </w:rPr>
-        <w:t xml:space="preserve"> </w:t>
-      </w:r>
-      <w:hyperlink r:id="rId94">
+      <w:hyperlink r:id="rId95">
         <w:r>
           <w:rPr>
-            <w:rStyle w:val="VerbatimChar"/>
-            <w:i/>
-            <w:iCs/>
+            <w:rStyle w:val="Hyperlink"/>
+            <w:b/>
+            <w:bCs/>
           </w:rPr>
-          <w:t xml:space="preserve">FEEDBACK.md</w:t>
+          <w:t xml:space="preserve">Give feedback / suggest a correction or asset</w:t>
         </w:r>
       </w:hyperlink>
       <w:r>
-        <w:rPr>
-          <w:i/>
-          <w:iCs/>
-        </w:rPr>
-        <w:t xml:space="preserve">).</w:t>
+        <w:t xml:space="preserve"> </w:t>
+      </w:r>
+      <w:r>
+        <w:t xml:space="preserve">— 2-minute form, no login.</w:t>
       </w:r>
     </w:p>
     <w:p>
@@ -14197,7 +14172,7 @@
       <w:r>
         <w:t xml:space="preserve"> </w:t>
       </w:r>
-      <w:hyperlink r:id="rId95">
+      <w:hyperlink r:id="rId96">
         <w:r>
           <w:rPr>
             <w:rStyle w:val="Hyperlink"/>
@@ -14211,7 +14186,7 @@
       <w:r>
         <w:t xml:space="preserve"> </w:t>
       </w:r>
-      <w:hyperlink r:id="rId96">
+      <w:hyperlink r:id="rId97">
         <w:r>
           <w:rPr>
             <w:rStyle w:val="Hyperlink"/>
@@ -14225,7 +14200,7 @@
       <w:r>
         <w:t xml:space="preserve"> </w:t>
       </w:r>
-      <w:hyperlink r:id="rId97">
+      <w:hyperlink r:id="rId98">
         <w:r>
           <w:rPr>
             <w:rStyle w:val="Hyperlink"/>
@@ -14244,9 +14219,9 @@
         </w:pict>
       </w:r>
     </w:p>
-    <w:bookmarkEnd w:id="98"/>
     <w:bookmarkEnd w:id="99"/>
-    <w:bookmarkStart w:id="100" w:name="annex-a"/>
+    <w:bookmarkEnd w:id="100"/>
+    <w:bookmarkStart w:id="101" w:name="annex-a"/>
     <w:p>
       <w:pPr>
         <w:pStyle w:val="Heading2"/>
@@ -27943,8 +27918,8 @@
         </w:pict>
       </w:r>
     </w:p>
-    <w:bookmarkEnd w:id="100"/>
-    <w:bookmarkStart w:id="101" w:name="annex-b"/>
+    <w:bookmarkEnd w:id="101"/>
+    <w:bookmarkStart w:id="102" w:name="annex-b"/>
     <w:p>
       <w:pPr>
         <w:pStyle w:val="Heading2"/>
@@ -28528,8 +28503,8 @@
         </w:pict>
       </w:r>
     </w:p>
-    <w:bookmarkEnd w:id="101"/>
-    <w:bookmarkStart w:id="104" w:name="annex-c"/>
+    <w:bookmarkEnd w:id="102"/>
+    <w:bookmarkStart w:id="105" w:name="annex-c"/>
     <w:p>
       <w:pPr>
         <w:pStyle w:val="Heading2"/>
@@ -28538,7 +28513,7 @@
         <w:t xml:space="preserve">Annex C — Merge log</w:t>
       </w:r>
     </w:p>
-    <w:bookmarkStart w:id="102" w:name="c.1-applied-consolidations"/>
+    <w:bookmarkStart w:id="103" w:name="c.1-applied-consolidations"/>
     <w:p>
       <w:pPr>
         <w:pStyle w:val="Heading3"/>
@@ -28850,8 +28825,8 @@
         </w:tc>
       </w:tr>
     </w:tbl>
-    <w:bookmarkEnd w:id="102"/>
-    <w:bookmarkStart w:id="103" w:name="c.2-recommended-for-catalogue"/>
+    <w:bookmarkEnd w:id="103"/>
+    <w:bookmarkStart w:id="104" w:name="c.2-recommended-for-catalogue"/>
     <w:p>
       <w:pPr>
         <w:pStyle w:val="Heading3"/>
@@ -28930,8 +28905,8 @@
         <w:t xml:space="preserve">are static and temporal versions of the same product — consider one catalogue record (2 → 1)</w:t>
       </w:r>
     </w:p>
-    <w:bookmarkEnd w:id="103"/>
     <w:bookmarkEnd w:id="104"/>
+    <w:bookmarkEnd w:id="105"/>
     <w:sectPr>
       <w:footnotePr>
         <w:numRestart w:val="eachSect"/>

</xml_diff>

<commit_message>
docs: publish refreshed report artifacts
</commit_message>
<xml_diff>
--- a/docs/report.docx
+++ b/docs/report.docx
@@ -23,7 +23,7 @@
         <w:pStyle w:val="Date"/>
       </w:pPr>
       <w:r>
-        <w:t xml:space="preserve">2026-06-17</w:t>
+        <w:t xml:space="preserve">2026-06-30</w:t>
       </w:r>
     </w:p>
     <w:sdt>
@@ -61,7 +61,7 @@
           <w:b/>
           <w:bCs/>
         </w:rPr>
-        <w:t xml:space="preserve">Version 1.0 (draft)</w:t>
+        <w:t xml:space="preserve">Version 1.0.1 (draft)</w:t>
       </w:r>
       <w:r>
         <w:t xml:space="preserve"> </w:t>
@@ -555,13 +555,13 @@
           <w:b/>
           <w:bCs/>
         </w:rPr>
-        <w:t xml:space="preserve">The strategic shortlist is already defined by the centres.</w:t>
+        <w:t xml:space="preserve">The centres’ nominations provide a strong starting point.</w:t>
       </w:r>
       <w:r>
         <w:t xml:space="preserve"> </w:t>
       </w:r>
       <w:r>
-        <w:t xml:space="preserve">The 28 top-three nominations come with written justifications and are the natural candidates for immediate Hub inclusion (</w:t>
+        <w:t xml:space="preserve">The 28 top-three nominations come with written justifications and are the primary starting set for immediate Hub consideration, but not the only assets that may enter Phase 1 review (</w:t>
       </w:r>
       <w:hyperlink w:anchor="sec-6-2">
         <w:r>
@@ -569,6 +569,20 @@
             <w:rStyle w:val="Hyperlink"/>
           </w:rPr>
           <w:t xml:space="preserve">Section 6.2</w:t>
+        </w:r>
+      </w:hyperlink>
+      <w:r>
+        <w:t xml:space="preserve">;</w:t>
+      </w:r>
+      <w:r>
+        <w:t xml:space="preserve"> </w:t>
+      </w:r>
+      <w:hyperlink w:anchor="sec-8">
+        <w:r>
+          <w:rPr>
+            <w:rStyle w:val="Hyperlink"/>
+          </w:rPr>
+          <w:t xml:space="preserve">Section 8</w:t>
         </w:r>
       </w:hyperlink>
       <w:r>
@@ -650,6 +664,40 @@
       </w:hyperlink>
       <w:r>
         <w:t xml:space="preserve">).</w:t>
+      </w:r>
+    </w:p>
+    <w:p>
+      <w:pPr>
+        <w:pStyle w:val="BlockText"/>
+      </w:pPr>
+      <w:r>
+        <w:rPr>
+          <w:b/>
+          <w:bCs/>
+        </w:rPr>
+        <w:t xml:space="preserve">Work-in-progress caveat.</w:t>
+      </w:r>
+      <w:r>
+        <w:t xml:space="preserve"> </w:t>
+      </w:r>
+      <w:r>
+        <w:t xml:space="preserve">This report is one piece of evidence to guide the Climate Data Hub, alongside other technical, strategic, and governance inputs; it does</w:t>
+      </w:r>
+      <w:r>
+        <w:t xml:space="preserve"> </w:t>
+      </w:r>
+      <w:r>
+        <w:rPr>
+          <w:b/>
+          <w:bCs/>
+        </w:rPr>
+        <w:t xml:space="preserve">not</w:t>
+      </w:r>
+      <w:r>
+        <w:t xml:space="preserve"> </w:t>
+      </w:r>
+      <w:r>
+        <w:t xml:space="preserve">by itself dictate exactly what the Hub will do. The mapping is iterative and will be updated as centres review their entries, flag corrections, and suggest additions. Centres and partners will have multiple opportunities across the annual CDH cycle to engage, refine priorities, and shape what comes next.</w:t>
       </w:r>
     </w:p>
     <w:p>
@@ -2131,7 +2179,7 @@
         </w:r>
       </w:hyperlink>
       <w:r>
-        <w:t xml:space="preserve">), ordered largest to smallest. Each bar is split into one coloured segment per nominating individual — a longer run of colours means more contributors behind a centre’s portfolio (e.g. AfricaRice and IITA drew on many nominators, while ILRI, IFPRI, and IRRI came through a single nominator). Segment colour is arbitrary and carries no meaning (hence no legend); the number is the centre total. The interactive dashboard names each nominator and their count on hover.</w:t>
+        <w:t xml:space="preserve">), ordered largest to smallest. Each bar is split into one coloured segment per nominating individual — a longer run of colours means more contributors behind a centre’s portfolio (e.g. AfricaRice and IITA drew on many nominators, while ILRI and IFPRI came through a single nominator). Segment colour is arbitrary and carries no meaning (hence no legend); the number is the centre total. Centres marked with an asterisk indicate cases where a single listed nominator may understate broader internal consultation or contribution. The interactive dashboard names each nominator and their count on hover.</w:t>
       </w:r>
     </w:p>
     <w:tbl>
@@ -2941,6 +2989,14 @@
         <w:t xml:space="preserve">Heatmap shows number of assets per centre per domain. Hybrid domain labels (e.g. Sensitivity / Adaptation Analytics, Adaptation Analytics / Mitigation) are excluded from heatmap for readability; they are included in Figure 2.</w:t>
       </w:r>
     </w:p>
+    <w:p>
+      <w:pPr>
+        <w:pStyle w:val="BodyText"/>
+      </w:pPr>
+      <w:r>
+        <w:t xml:space="preserve">A further interpretation caveat is that current centre profiles may reflect how assets were surfaced, not only the full thematic breadth held within each centre. In particular, IFPRI’s current submission sits entirely in Exposure and ILRI’s entirely in Hazard, so targeted next-round outreach would help test whether those centre-level profiles are complete or mainly reflect the first-round submission pathway.</w:t>
+      </w:r>
+    </w:p>
     <w:bookmarkEnd w:id="32"/>
     <w:bookmarkEnd w:id="33"/>
     <w:bookmarkStart w:id="37" w:name="sec-4-3"/>
@@ -13262,7 +13318,7 @@
         <w:t xml:space="preserve">thin on adaptive capacity, in Latin America and Asia, and dependent on single centres in several domains</w:t>
       </w:r>
       <w:r>
-        <w:t xml:space="preserve">. For the Hub, the immediate move is clear: act on the 28 open, ready, high-value assets and the centres’ 28 strategic nominations now; open access conversations for the high-value-but-restricted assets in parallel; preprocess shared climate inputs once; and bring CIMMYT and ICARDA into the next cycle to close the most visible gaps. The detail sits in Sections 5 and 6; this is the throughline.</w:t>
+        <w:t xml:space="preserve">. For the Hub, the immediate move is clear: act on the 28 open, ready, high-value assets now; use the centres’ 28 strategic nominations as the primary starting set rather than the only filter; open access conversations for the high-value-but-restricted assets in parallel; preprocess shared climate inputs once; and run a targeted next-round outreach to close visible gaps, especially where current submissions likely under-represent important domains such as adaptive capacity. The detail sits in Sections 5 and 6; this is the throughline.</w:t>
       </w:r>
     </w:p>
     <w:p>
@@ -13318,13 +13374,13 @@
           <w:b/>
           <w:bCs/>
         </w:rPr>
-        <w:t xml:space="preserve">Prioritise assets for Hub integration</w:t>
+        <w:t xml:space="preserve">Run targeted gap-filling outreach</w:t>
       </w:r>
       <w:r>
         <w:t xml:space="preserve"> </w:t>
       </w:r>
       <w:r>
-        <w:t xml:space="preserve">— use asset rank and Hub role to sequence technical work.</w:t>
+        <w:t xml:space="preserve">— use the Q2 workshop and other CGIAR channels to identify strong but currently under-represented assets in missing domains or geographies, especially adaptive-capacity assets and gaps in Latin America and Asia. A next round of outreach with ILRI and IFPRI could also usefully broaden thematic coverage, helping ensure that the current submissions are complemented by a wider range of climate-relevant assets from across each centre.</w:t>
       </w:r>
     </w:p>
     <w:p>
@@ -13340,13 +13396,13 @@
           <w:b/>
           <w:bCs/>
         </w:rPr>
-        <w:t xml:space="preserve">Agree federation vs ingestion for each priority asset</w:t>
+        <w:t xml:space="preserve">Prioritise assets for Hub integration</w:t>
       </w:r>
       <w:r>
         <w:t xml:space="preserve"> </w:t>
       </w:r>
       <w:r>
-        <w:t xml:space="preserve">— work with data owners to determine appropriate integration pathway.</w:t>
+        <w:t xml:space="preserve">— use centre rank and Hub role to sequence technical work, but do not limit Phase 1 consideration strictly to the current top-three nominations where wider strategic value or obvious submission gaps suggest additional assets should be reviewed.</w:t>
       </w:r>
     </w:p>
     <w:p>
@@ -13362,13 +13418,13 @@
           <w:b/>
           <w:bCs/>
         </w:rPr>
-        <w:t xml:space="preserve">Publish asset catalogue</w:t>
+        <w:t xml:space="preserve">Agree federation vs ingestion for each priority asset</w:t>
       </w:r>
       <w:r>
         <w:t xml:space="preserve"> </w:t>
       </w:r>
       <w:r>
-        <w:t xml:space="preserve">— make inventory available to CGIAR partners via CDH portal.</w:t>
+        <w:t xml:space="preserve">— work with data owners to determine appropriate integration pathway.</w:t>
       </w:r>
     </w:p>
     <w:p>
@@ -13384,6 +13440,28 @@
           <w:b/>
           <w:bCs/>
         </w:rPr>
+        <w:t xml:space="preserve">Publish asset catalogue</w:t>
+      </w:r>
+      <w:r>
+        <w:t xml:space="preserve"> </w:t>
+      </w:r>
+      <w:r>
+        <w:t xml:space="preserve">— make inventory available to CGIAR partners via CDH portal.</w:t>
+      </w:r>
+    </w:p>
+    <w:p>
+      <w:pPr>
+        <w:pStyle w:val="Compact"/>
+        <w:numPr>
+          <w:ilvl w:val="0"/>
+          <w:numId w:val="1008"/>
+        </w:numPr>
+      </w:pPr>
+      <w:r>
+        <w:rPr>
+          <w:b/>
+          <w:bCs/>
+        </w:rPr>
         <w:t xml:space="preserve">Iterate mapping annually</w:t>
       </w:r>
       <w:r>
@@ -13416,6 +13494,18 @@
       </w:pPr>
       <w:r>
         <w:t xml:space="preserve">This mapping exists only because colleagues across the centres took the time to nominate, describe, rank, and justify their strongest climate data assets — a substantial effort on top of busy research agendas. We are sincerely grateful to every contributor, and in particular to the centre focal points and nominators listed below.</w:t>
+      </w:r>
+    </w:p>
+    <w:p>
+      <w:pPr>
+        <w:pStyle w:val="BodyText"/>
+      </w:pPr>
+      <w:r>
+        <w:rPr>
+          <w:i/>
+          <w:iCs/>
+        </w:rPr>
+        <w:t xml:space="preserve">Coordinator names are shown in bold in the table below.</w:t>
       </w:r>
     </w:p>
     <w:tbl>
@@ -13475,7 +13565,20 @@
               <w:pStyle w:val="Compact"/>
             </w:pPr>
             <w:r>
-              <w:t xml:space="preserve">Aboubacar Diallo; Ali Ibrahim; Elliott Dossou-Yovo; Geoffrey Onaga; Mohamed Diallo; Paul Iboko</w:t>
+              <w:t xml:space="preserve">Aboubacar Diallo; Ali Ibrahim;</w:t>
+            </w:r>
+            <w:r>
+              <w:t xml:space="preserve"> </w:t>
+            </w:r>
+            <w:r>
+              <w:rPr>
+                <w:b/>
+                <w:bCs/>
+              </w:rPr>
+              <w:t xml:space="preserve">Elliott Dossou-Yovo</w:t>
+            </w:r>
+            <w:r>
+              <w:t xml:space="preserve">; Geoffrey Onaga; Mohamed Diallo; Paul Iboko</w:t>
             </w:r>
           </w:p>
         </w:tc>
@@ -13499,7 +13602,17 @@
               <w:pStyle w:val="Compact"/>
             </w:pPr>
             <w:r>
-              <w:t xml:space="preserve">Alcade Segnon; Alejandro Ruden; Camilo Barrios; Carlos E. Navarro Racines; Carlos Gonzalez; Kaue De Sousa; Robert S. Andrade; Shalika Vyas; Tosin Akingbemisilu; Xiaojing Wei</w:t>
+              <w:t xml:space="preserve">Alcade Segnon; Alejandro Ruden; Camilo Barrios; Carlos E. Navarro Racines; Carlos Gonzalez; Kaue De Sousa; Robert S. Andrade; Shalika Vyas; Tosin Akingbemisilu;</w:t>
+            </w:r>
+            <w:r>
+              <w:t xml:space="preserve"> </w:t>
+            </w:r>
+            <w:r>
+              <w:rPr>
+                <w:b/>
+                <w:bCs/>
+              </w:rPr>
+              <w:t xml:space="preserve">Xiaojing Wei</w:t>
             </w:r>
           </w:p>
         </w:tc>
@@ -13523,7 +13636,20 @@
               <w:pStyle w:val="Compact"/>
             </w:pPr>
             <w:r>
-              <w:t xml:space="preserve">Ardhani, Trialaksita; Brockhaus, M.; Ickowitz, A.; Tamba, Yvonne; Winowiecki, Leigh Ann; Winowiecki, Leigh Ann (ICRAF)</w:t>
+              <w:t xml:space="preserve">Ardhani, Trialaksita; Brockhaus, M.; Ickowitz, A.;</w:t>
+            </w:r>
+            <w:r>
+              <w:t xml:space="preserve"> </w:t>
+            </w:r>
+            <w:r>
+              <w:rPr>
+                <w:b/>
+                <w:bCs/>
+              </w:rPr>
+              <w:t xml:space="preserve">Sufiet Erlita</w:t>
+            </w:r>
+            <w:r>
+              <w:t xml:space="preserve">; Tamba, Yvonne; Winowiecki, Leigh Ann; Winowiecki, Leigh Ann (ICRAF)</w:t>
             </w:r>
           </w:p>
         </w:tc>
@@ -13547,7 +13673,20 @@
               <w:pStyle w:val="Compact"/>
             </w:pPr>
             <w:r>
-              <w:t xml:space="preserve">David Ramirez; Heidy Gamarra; Henry Juarez; Robert Hijmans</w:t>
+              <w:t xml:space="preserve">David Ramirez; Heidy Gamarra;</w:t>
+            </w:r>
+            <w:r>
+              <w:t xml:space="preserve"> </w:t>
+            </w:r>
+            <w:r>
+              <w:rPr>
+                <w:b/>
+                <w:bCs/>
+              </w:rPr>
+              <w:t xml:space="preserve">Henry Juarez</w:t>
+            </w:r>
+            <w:r>
+              <w:t xml:space="preserve">; Robert Hijmans</w:t>
             </w:r>
           </w:p>
         </w:tc>
@@ -13560,18 +13699,35 @@
               <w:pStyle w:val="Compact"/>
             </w:pPr>
             <w:r>
-              <w:t xml:space="preserve">IFPRI</w:t>
-            </w:r>
-          </w:p>
-        </w:tc>
-        <w:tc>
-          <w:tcPr/>
-          <w:p>
-            <w:pPr>
-              <w:pStyle w:val="Compact"/>
-            </w:pPr>
-            <w:r>
-              <w:t xml:space="preserve">Zhe Guo</w:t>
+              <w:t xml:space="preserve">ICRISAT</w:t>
+            </w:r>
+          </w:p>
+        </w:tc>
+        <w:tc>
+          <w:tcPr/>
+          <w:p>
+            <w:pPr>
+              <w:pStyle w:val="Compact"/>
+            </w:pPr>
+            <w:r>
+              <w:rPr>
+                <w:b/>
+                <w:bCs/>
+              </w:rPr>
+              <w:t xml:space="preserve">Mamta Sharma</w:t>
+            </w:r>
+            <w:r>
+              <w:t xml:space="preserve">;</w:t>
+            </w:r>
+            <w:r>
+              <w:t xml:space="preserve"> </w:t>
+            </w:r>
+            <w:r>
+              <w:rPr>
+                <w:b/>
+                <w:bCs/>
+              </w:rPr>
+              <w:t xml:space="preserve">Raman Babu</w:t>
             </w:r>
           </w:p>
         </w:tc>
@@ -13584,18 +13740,18 @@
               <w:pStyle w:val="Compact"/>
             </w:pPr>
             <w:r>
-              <w:t xml:space="preserve">IITA</w:t>
-            </w:r>
-          </w:p>
-        </w:tc>
-        <w:tc>
-          <w:tcPr/>
-          <w:p>
-            <w:pPr>
-              <w:pStyle w:val="Compact"/>
-            </w:pPr>
-            <w:r>
-              <w:t xml:space="preserve">Eduardo Garcia Bendito; Francis Muthoni; Harun Murithi; James Legg; John Omondi; Julius Adewopo; Peter Neuenschwander; Rhys Manners; Siyabusa Mkuhlani; Thompson Ogunsanmi</w:t>
+              <w:t xml:space="preserve">IFPRI</w:t>
+            </w:r>
+          </w:p>
+        </w:tc>
+        <w:tc>
+          <w:tcPr/>
+          <w:p>
+            <w:pPr>
+              <w:pStyle w:val="Compact"/>
+            </w:pPr>
+            <w:r>
+              <w:t xml:space="preserve">Zhe Guo</w:t>
             </w:r>
           </w:p>
         </w:tc>
@@ -13608,18 +13764,31 @@
               <w:pStyle w:val="Compact"/>
             </w:pPr>
             <w:r>
-              <w:t xml:space="preserve">ILRI</w:t>
-            </w:r>
-          </w:p>
-        </w:tc>
-        <w:tc>
-          <w:tcPr/>
-          <w:p>
-            <w:pPr>
-              <w:pStyle w:val="Compact"/>
-            </w:pPr>
-            <w:r>
-              <w:t xml:space="preserve">Teferi Demissie</w:t>
+              <w:t xml:space="preserve">IITA</w:t>
+            </w:r>
+          </w:p>
+        </w:tc>
+        <w:tc>
+          <w:tcPr/>
+          <w:p>
+            <w:pPr>
+              <w:pStyle w:val="Compact"/>
+            </w:pPr>
+            <w:r>
+              <w:t xml:space="preserve">Eduardo Garcia Bendito;</w:t>
+            </w:r>
+            <w:r>
+              <w:t xml:space="preserve"> </w:t>
+            </w:r>
+            <w:r>
+              <w:rPr>
+                <w:b/>
+                <w:bCs/>
+              </w:rPr>
+              <w:t xml:space="preserve">Francis Muthoni</w:t>
+            </w:r>
+            <w:r>
+              <w:t xml:space="preserve">; Harun Murithi; James Legg; John Omondi; Julius Adewopo; Peter Neuenschwander; Rhys Manners; Siyabusa Mkuhlani; Thompson Ogunsanmi</w:t>
             </w:r>
           </w:p>
         </w:tc>
@@ -13632,18 +13801,18 @@
               <w:pStyle w:val="Compact"/>
             </w:pPr>
             <w:r>
-              <w:t xml:space="preserve">IRRI</w:t>
-            </w:r>
-          </w:p>
-        </w:tc>
-        <w:tc>
-          <w:tcPr/>
-          <w:p>
-            <w:pPr>
-              <w:pStyle w:val="Compact"/>
-            </w:pPr>
-            <w:r>
-              <w:t xml:space="preserve">a.urfels@cgiar.org</w:t>
+              <w:t xml:space="preserve">ILRI</w:t>
+            </w:r>
+          </w:p>
+        </w:tc>
+        <w:tc>
+          <w:tcPr/>
+          <w:p>
+            <w:pPr>
+              <w:pStyle w:val="Compact"/>
+            </w:pPr>
+            <w:r>
+              <w:t xml:space="preserve">Teferi Demissie</w:t>
             </w:r>
           </w:p>
         </w:tc>
@@ -13656,18 +13825,28 @@
               <w:pStyle w:val="Compact"/>
             </w:pPr>
             <w:r>
-              <w:t xml:space="preserve">IWMI</w:t>
-            </w:r>
-          </w:p>
-        </w:tc>
-        <w:tc>
-          <w:tcPr/>
-          <w:p>
-            <w:pPr>
-              <w:pStyle w:val="Compact"/>
-            </w:pPr>
-            <w:r>
-              <w:t xml:space="preserve">Giriraj Amarnath; Niranga Alahacoon</w:t>
+              <w:t xml:space="preserve">IRRI</w:t>
+            </w:r>
+          </w:p>
+        </w:tc>
+        <w:tc>
+          <w:tcPr/>
+          <w:p>
+            <w:pPr>
+              <w:pStyle w:val="Compact"/>
+            </w:pPr>
+            <w:r>
+              <w:t xml:space="preserve">Anton Urfels;</w:t>
+            </w:r>
+            <w:r>
+              <w:t xml:space="preserve"> </w:t>
+            </w:r>
+            <w:r>
+              <w:rPr>
+                <w:b/>
+                <w:bCs/>
+              </w:rPr>
+              <w:t xml:space="preserve">Emma Quicho-Diangkinay</w:t>
             </w:r>
           </w:p>
         </w:tc>
@@ -13680,6 +13859,37 @@
               <w:pStyle w:val="Compact"/>
             </w:pPr>
             <w:r>
+              <w:t xml:space="preserve">IWMI</w:t>
+            </w:r>
+          </w:p>
+        </w:tc>
+        <w:tc>
+          <w:tcPr/>
+          <w:p>
+            <w:pPr>
+              <w:pStyle w:val="Compact"/>
+            </w:pPr>
+            <w:r>
+              <w:rPr>
+                <w:b/>
+                <w:bCs/>
+              </w:rPr>
+              <w:t xml:space="preserve">Giriraj Amarnath</w:t>
+            </w:r>
+            <w:r>
+              <w:t xml:space="preserve">; Niranga Alahacoon</w:t>
+            </w:r>
+          </w:p>
+        </w:tc>
+      </w:tr>
+      <w:tr>
+        <w:tc>
+          <w:tcPr/>
+          <w:p>
+            <w:pPr>
+              <w:pStyle w:val="Compact"/>
+            </w:pPr>
+            <w:r>
               <w:t xml:space="preserve">WorldFish</w:t>
             </w:r>
           </w:p>
@@ -13691,7 +13901,7 @@
               <w:pStyle w:val="Compact"/>
             </w:pPr>
             <w:r>
-              <w:t xml:space="preserve">Michelle Tigchelaar</w:t>
+              <w:t xml:space="preserve">Michelle Tigchelaar; Thomas Kirina</w:t>
             </w:r>
           </w:p>
         </w:tc>
@@ -13702,6 +13912,24 @@
         <w:pStyle w:val="BodyText"/>
       </w:pPr>
       <w:r>
+        <w:rPr>
+          <w:i/>
+          <w:iCs/>
+        </w:rPr>
+        <w:t xml:space="preserve">IRRI note:</w:t>
+      </w:r>
+      <w:r>
+        <w:t xml:space="preserve"> </w:t>
+      </w:r>
+      <w:r>
+        <w:t xml:space="preserve">Emma Quicho-Diangkinay coordinated the IRRI submission. The current submission records list Anton Urfels as nominator on the catalogued items, but broader IRRI contributor attribution is being checked and may be updated after review.</w:t>
+      </w:r>
+    </w:p>
+    <w:p>
+      <w:pPr>
+        <w:pStyle w:val="BodyText"/>
+      </w:pPr>
+      <w:r>
         <w:t xml:space="preserve">Coordination of the asset-mapping exercise is led by the Alliance of Bioversity International &amp; CIAT under the Climate Action Program (Critical Capacity PoD2), in collaboration with the Climate Data Hub team and AoW1. Thanks also to the centre contacts who fielded follow-up questions on access, format, and provenance. Any errors of consolidation or normalisation are the compilers’, not the contributors’.</w:t>
       </w:r>
     </w:p>
@@ -13713,13 +13941,13 @@
       </w:r>
     </w:p>
     <w:bookmarkEnd w:id="85"/>
-    <w:bookmarkStart w:id="100" w:name="data-access-feedback-and-reproducibility"/>
+    <w:bookmarkStart w:id="94" w:name="data-access-and-reproducibility"/>
     <w:p>
       <w:pPr>
         <w:pStyle w:val="Heading2"/>
       </w:pPr>
       <w:r>
-        <w:t xml:space="preserve">Data Access, Feedback and Reproducibility</w:t>
+        <w:t xml:space="preserve">Data Access and Reproducibility</w:t>
       </w:r>
     </w:p>
     <w:p>
@@ -14088,7 +14316,24 @@
         <w:t xml:space="preserve"># or: --to docx</w:t>
       </w:r>
     </w:p>
-    <w:bookmarkStart w:id="99" w:name="X981c30afc5d34005fa58438231531a13ce51028"/>
+    <w:p>
+      <w:r>
+        <w:pict>
+          <v:rect style="width:0;height:1.5pt" o:hralign="center" o:hrstd="t" o:hr="t"/>
+        </w:pict>
+      </w:r>
+    </w:p>
+    <w:bookmarkEnd w:id="94"/>
+    <w:bookmarkStart w:id="109" w:name="feedback-and-review"/>
+    <w:p>
+      <w:pPr>
+        <w:pStyle w:val="Heading2"/>
+      </w:pPr>
+      <w:r>
+        <w:t xml:space="preserve">Feedback and Review</w:t>
+      </w:r>
+    </w:p>
+    <w:bookmarkStart w:id="108" w:name="X981c30afc5d34005fa58438231531a13ce51028"/>
     <w:p>
       <w:pPr>
         <w:pStyle w:val="Heading3"/>
@@ -14123,7 +14368,7 @@
       <w:r>
         <w:t xml:space="preserve"> </w:t>
       </w:r>
-      <w:hyperlink r:id="rId94">
+      <w:hyperlink r:id="rId95">
         <w:r>
           <w:rPr>
             <w:rStyle w:val="VerbatimChar"/>
@@ -14145,7 +14390,7 @@
       <w:r>
         <w:t xml:space="preserve"> </w:t>
       </w:r>
-      <w:hyperlink r:id="rId95">
+      <w:hyperlink r:id="rId96">
         <w:r>
           <w:rPr>
             <w:rStyle w:val="Hyperlink"/>
@@ -14172,7 +14417,7 @@
       <w:r>
         <w:t xml:space="preserve"> </w:t>
       </w:r>
-      <w:hyperlink r:id="rId96">
+      <w:hyperlink r:id="rId97">
         <w:r>
           <w:rPr>
             <w:rStyle w:val="Hyperlink"/>
@@ -14186,7 +14431,7 @@
       <w:r>
         <w:t xml:space="preserve"> </w:t>
       </w:r>
-      <w:hyperlink r:id="rId97">
+      <w:hyperlink r:id="rId98">
         <w:r>
           <w:rPr>
             <w:rStyle w:val="Hyperlink"/>
@@ -14200,7 +14445,7 @@
       <w:r>
         <w:t xml:space="preserve"> </w:t>
       </w:r>
-      <w:hyperlink r:id="rId98">
+      <w:hyperlink r:id="rId99">
         <w:r>
           <w:rPr>
             <w:rStyle w:val="Hyperlink"/>
@@ -14212,6 +14457,355 @@
         <w:t xml:space="preserve">.</w:t>
       </w:r>
     </w:p>
+    <w:tbl>
+      <w:tblPr>
+        <w:tblStyle w:val="Table"/>
+        <w:tblInd w:w="164" w:type="dxa"/>
+        <w:tblBorders>
+          <w:left w:val="single" w:sz="24" w:space="0" w:color="0758E5"/>
+        </w:tblBorders>
+        <w:tblCellMar>
+          <w:left w:w="0" w:type="dxa"/>
+          <w:right w:w="0" w:type="dxa"/>
+        </w:tblCellMar>
+        <w:tblLook w:firstRow="0" w:lastRow="0" w:firstColumn="0" w:lastColumn="0" w:noHBand="0" w:noVBand="0" w:val="0000"/>
+      </w:tblPr>
+      <w:tblGrid>
+        <w:gridCol w:w="7920"/>
+      </w:tblGrid>
+      <w:tr>
+        <w:trPr>
+          <w:cantSplit/>
+        </w:trPr>
+        <w:tc>
+          <w:tcPr>
+            <w:tcMar>
+              <w:left w:w="144" w:type="dxa"/>
+              <w:right w:w="144" w:type="dxa"/>
+            </w:tcMar>
+          </w:tcPr>
+          <w:p>
+            <w:pPr>
+              <w:pStyle w:val="BodyText"/>
+            </w:pPr>
+            <w:pPr>
+              <w:spacing w:before="0" w:after="8"/>
+              <w:jc w:val="center"/>
+            </w:pPr>
+            <w:r>
+              <w:drawing>
+                <wp:inline>
+                  <wp:extent cx="152400" cy="152400"/>
+                  <wp:effectExtent b="0" l="0" r="0" t="0"/>
+                  <wp:docPr descr="" title="" id="101" name="Picture"/>
+                  <a:graphic>
+                    <a:graphicData uri="http://schemas.openxmlformats.org/drawingml/2006/picture">
+                      <pic:pic>
+                        <pic:nvPicPr>
+                          <pic:cNvPr descr="/Applications/quarto/share/formats/docx/note.png" id="102" name="Picture"/>
+                          <pic:cNvPicPr>
+                            <a:picLocks noChangeArrowheads="1" noChangeAspect="1"/>
+                          </pic:cNvPicPr>
+                        </pic:nvPicPr>
+                        <pic:blipFill>
+                          <a:blip r:embed="rId100"/>
+                          <a:stretch>
+                            <a:fillRect/>
+                          </a:stretch>
+                        </pic:blipFill>
+                        <pic:spPr bwMode="auto">
+                          <a:xfrm>
+                            <a:off x="0" y="0"/>
+                            <a:ext cx="152400" cy="152400"/>
+                          </a:xfrm>
+                          <a:prstGeom prst="rect">
+                            <a:avLst/>
+                          </a:prstGeom>
+                          <a:noFill/>
+                          <a:ln w="9525">
+                            <a:noFill/>
+                            <a:headEnd/>
+                            <a:tailEnd/>
+                          </a:ln>
+                        </pic:spPr>
+                      </pic:pic>
+                    </a:graphicData>
+                  </a:graphic>
+                </wp:inline>
+              </w:drawing>
+            </w:r>
+          </w:p>
+        </w:tc>
+        <w:tc>
+          <w:p>
+            <w:pPr>
+              <w:pStyle w:val="BodyText"/>
+            </w:pPr>
+            <w:pPr>
+              <w:spacing w:before="16" w:after="64"/>
+            </w:pPr>
+            <w:r>
+              <w:rPr>
+                <w:b/>
+                <w:bCs/>
+              </w:rPr>
+              <w:t xml:space="preserve">Current review feedback themes</w:t>
+            </w:r>
+          </w:p>
+          <w:p>
+            <w:pPr>
+              <w:pStyle w:val="BodyText"/>
+            </w:pPr>
+            <w:pPr>
+              <w:spacing w:before="16"/>
+            </w:pPr>
+            <w:r>
+              <w:rPr>
+                <w:i/>
+                <w:iCs/>
+              </w:rPr>
+              <w:t xml:space="preserve">Last updated: 30 June 2026.</w:t>
+            </w:r>
+            <w:r>
+              <w:t xml:space="preserve"> </w:t>
+            </w:r>
+            <w:r>
+              <w:t xml:space="preserve">This internal-review note summarises the current open feedback themes logged in GitHub. It is included for transparency and may change as comments are resolved; it is</w:t>
+            </w:r>
+            <w:r>
+              <w:t xml:space="preserve"> </w:t>
+            </w:r>
+            <w:r>
+              <w:rPr>
+                <w:b/>
+                <w:bCs/>
+              </w:rPr>
+              <w:t xml:space="preserve">not</w:t>
+            </w:r>
+            <w:r>
+              <w:t xml:space="preserve"> </w:t>
+            </w:r>
+            <w:r>
+              <w:t xml:space="preserve">part of the asset statistics above. Some points from this feedback have already been incorporated into</w:t>
+            </w:r>
+            <w:r>
+              <w:t xml:space="preserve"> </w:t>
+            </w:r>
+            <w:hyperlink w:anchor="sec-8">
+              <w:r>
+                <w:rPr>
+                  <w:rStyle w:val="Hyperlink"/>
+                </w:rPr>
+                <w:t xml:space="preserve">Section 8</w:t>
+              </w:r>
+            </w:hyperlink>
+            <w:r>
+              <w:t xml:space="preserve"> </w:t>
+            </w:r>
+            <w:r>
+              <w:t xml:space="preserve">(Next Steps).</w:t>
+            </w:r>
+          </w:p>
+          <w:p>
+            <w:pPr>
+              <w:pStyle w:val="Compact"/>
+              <w:numPr>
+                <w:ilvl w:val="0"/>
+                <w:numId w:val="1011"/>
+              </w:numPr>
+            </w:pPr>
+            <w:r>
+              <w:rPr>
+                <w:b/>
+                <w:bCs/>
+              </w:rPr>
+              <w:t xml:space="preserve">Implemented in the revised recommendations</w:t>
+            </w:r>
+            <w:r>
+              <w:t xml:space="preserve"> </w:t>
+            </w:r>
+            <w:r>
+              <w:t xml:space="preserve">— targeted gap-filling outreach and a broader prioritisation approach that does not treat current top-three nominations as the only candidates for Phase 1 review (</w:t>
+            </w:r>
+            <w:hyperlink r:id="rId103">
+              <w:r>
+                <w:rPr>
+                  <w:rStyle w:val="Hyperlink"/>
+                </w:rPr>
+                <w:t xml:space="preserve">#5</w:t>
+              </w:r>
+            </w:hyperlink>
+            <w:r>
+              <w:t xml:space="preserve">,</w:t>
+            </w:r>
+            <w:r>
+              <w:t xml:space="preserve"> </w:t>
+            </w:r>
+            <w:hyperlink r:id="rId104">
+              <w:r>
+                <w:rPr>
+                  <w:rStyle w:val="Hyperlink"/>
+                </w:rPr>
+                <w:t xml:space="preserve">#6</w:t>
+              </w:r>
+            </w:hyperlink>
+            <w:r>
+              <w:t xml:space="preserve">).</w:t>
+            </w:r>
+          </w:p>
+          <w:p>
+            <w:pPr>
+              <w:pStyle w:val="Compact"/>
+              <w:numPr>
+                <w:ilvl w:val="0"/>
+                <w:numId w:val="1011"/>
+              </w:numPr>
+            </w:pPr>
+            <w:r>
+              <w:rPr>
+                <w:b/>
+                <w:bCs/>
+              </w:rPr>
+              <w:t xml:space="preserve">Still open for discussion</w:t>
+            </w:r>
+            <w:r>
+              <w:t xml:space="preserve"> </w:t>
+            </w:r>
+            <w:r>
+              <w:t xml:space="preserve">— complement this catalogue of assets produced with evidence on which climate datasets, boundaries, and crop or land-use maps people actually use across CGIAR (</w:t>
+            </w:r>
+            <w:hyperlink r:id="rId105">
+              <w:r>
+                <w:rPr>
+                  <w:rStyle w:val="Hyperlink"/>
+                </w:rPr>
+                <w:t xml:space="preserve">#4</w:t>
+              </w:r>
+            </w:hyperlink>
+            <w:r>
+              <w:t xml:space="preserve">).</w:t>
+            </w:r>
+          </w:p>
+          <w:p>
+            <w:pPr>
+              <w:pStyle w:val="Compact"/>
+              <w:numPr>
+                <w:ilvl w:val="0"/>
+                <w:numId w:val="1011"/>
+              </w:numPr>
+            </w:pPr>
+            <w:r>
+              <w:rPr>
+                <w:b/>
+                <w:bCs/>
+              </w:rPr>
+              <w:t xml:space="preserve">Still open for discussion</w:t>
+            </w:r>
+            <w:r>
+              <w:t xml:space="preserve"> </w:t>
+            </w:r>
+            <w:r>
+              <w:t xml:space="preserve">— clarify governance for inclusion decisions, consider whether restricted-access assets should receive lower near-term priority, and distinguish underlying datasets from tools or catalogues (</w:t>
+            </w:r>
+            <w:hyperlink r:id="rId106">
+              <w:r>
+                <w:rPr>
+                  <w:rStyle w:val="Hyperlink"/>
+                </w:rPr>
+                <w:t xml:space="preserve">#1</w:t>
+              </w:r>
+            </w:hyperlink>
+            <w:r>
+              <w:t xml:space="preserve">).</w:t>
+            </w:r>
+          </w:p>
+          <w:p>
+            <w:pPr>
+              <w:pStyle w:val="FirstParagraph"/>
+            </w:pPr>
+            <w:pPr>
+              <w:spacing w:after="16"/>
+            </w:pPr>
+            <w:r>
+              <w:t xml:space="preserve">Interested readers can view the live GitHub discussion:</w:t>
+            </w:r>
+            <w:r>
+              <w:t xml:space="preserve"> </w:t>
+            </w:r>
+            <w:hyperlink r:id="rId107">
+              <w:r>
+                <w:rPr>
+                  <w:rStyle w:val="Hyperlink"/>
+                </w:rPr>
+                <w:t xml:space="preserve">all open feedback issues</w:t>
+              </w:r>
+            </w:hyperlink>
+            <w:r>
+              <w:t xml:space="preserve"> </w:t>
+            </w:r>
+            <w:r>
+              <w:t xml:space="preserve">or</w:t>
+            </w:r>
+            <w:r>
+              <w:t xml:space="preserve"> </w:t>
+            </w:r>
+            <w:hyperlink r:id="rId104">
+              <w:r>
+                <w:rPr>
+                  <w:rStyle w:val="Hyperlink"/>
+                </w:rPr>
+                <w:t xml:space="preserve">#6</w:t>
+              </w:r>
+            </w:hyperlink>
+            <w:r>
+              <w:t xml:space="preserve">,</w:t>
+            </w:r>
+            <w:r>
+              <w:t xml:space="preserve"> </w:t>
+            </w:r>
+            <w:hyperlink r:id="rId103">
+              <w:r>
+                <w:rPr>
+                  <w:rStyle w:val="Hyperlink"/>
+                </w:rPr>
+                <w:t xml:space="preserve">#5</w:t>
+              </w:r>
+            </w:hyperlink>
+            <w:r>
+              <w:t xml:space="preserve">,</w:t>
+            </w:r>
+            <w:r>
+              <w:t xml:space="preserve"> </w:t>
+            </w:r>
+            <w:hyperlink r:id="rId105">
+              <w:r>
+                <w:rPr>
+                  <w:rStyle w:val="Hyperlink"/>
+                </w:rPr>
+                <w:t xml:space="preserve">#4</w:t>
+              </w:r>
+            </w:hyperlink>
+            <w:r>
+              <w:t xml:space="preserve">,</w:t>
+            </w:r>
+            <w:r>
+              <w:t xml:space="preserve"> </w:t>
+            </w:r>
+            <w:hyperlink r:id="rId106">
+              <w:r>
+                <w:rPr>
+                  <w:rStyle w:val="Hyperlink"/>
+                </w:rPr>
+                <w:t xml:space="preserve">#1</w:t>
+              </w:r>
+            </w:hyperlink>
+            <w:r>
+              <w:t xml:space="preserve">.</w:t>
+            </w:r>
+          </w:p>
+        </w:tc>
+      </w:tr>
+    </w:tbl>
     <w:p>
       <w:r>
         <w:pict>
@@ -14219,9 +14813,9 @@
         </w:pict>
       </w:r>
     </w:p>
-    <w:bookmarkEnd w:id="99"/>
-    <w:bookmarkEnd w:id="100"/>
-    <w:bookmarkStart w:id="101" w:name="annex-a"/>
+    <w:bookmarkEnd w:id="108"/>
+    <w:bookmarkEnd w:id="109"/>
+    <w:bookmarkStart w:id="110" w:name="annex-a"/>
     <w:p>
       <w:pPr>
         <w:pStyle w:val="Heading2"/>
@@ -27918,8 +28512,8 @@
         </w:pict>
       </w:r>
     </w:p>
-    <w:bookmarkEnd w:id="101"/>
-    <w:bookmarkStart w:id="102" w:name="annex-b"/>
+    <w:bookmarkEnd w:id="110"/>
+    <w:bookmarkStart w:id="111" w:name="annex-b"/>
     <w:p>
       <w:pPr>
         <w:pStyle w:val="Heading2"/>
@@ -28503,8 +29097,8 @@
         </w:pict>
       </w:r>
     </w:p>
-    <w:bookmarkEnd w:id="102"/>
-    <w:bookmarkStart w:id="105" w:name="annex-c"/>
+    <w:bookmarkEnd w:id="111"/>
+    <w:bookmarkStart w:id="114" w:name="annex-c"/>
     <w:p>
       <w:pPr>
         <w:pStyle w:val="Heading2"/>
@@ -28513,7 +29107,7 @@
         <w:t xml:space="preserve">Annex C — Merge log</w:t>
       </w:r>
     </w:p>
-    <w:bookmarkStart w:id="103" w:name="c.1-applied-consolidations"/>
+    <w:bookmarkStart w:id="112" w:name="c.1-applied-consolidations"/>
     <w:p>
       <w:pPr>
         <w:pStyle w:val="Heading3"/>
@@ -28825,8 +29419,8 @@
         </w:tc>
       </w:tr>
     </w:tbl>
-    <w:bookmarkEnd w:id="103"/>
-    <w:bookmarkStart w:id="104" w:name="c.2-recommended-for-catalogue"/>
+    <w:bookmarkEnd w:id="112"/>
+    <w:bookmarkStart w:id="113" w:name="c.2-recommended-for-catalogue"/>
     <w:p>
       <w:pPr>
         <w:pStyle w:val="Heading3"/>
@@ -28848,7 +29442,7 @@
         <w:pStyle w:val="Compact"/>
         <w:numPr>
           <w:ilvl w:val="0"/>
-          <w:numId w:val="1011"/>
+          <w:numId w:val="1012"/>
         </w:numPr>
       </w:pPr>
       <w:r>
@@ -28867,7 +29461,7 @@
         <w:pStyle w:val="Compact"/>
         <w:numPr>
           <w:ilvl w:val="0"/>
-          <w:numId w:val="1011"/>
+          <w:numId w:val="1012"/>
         </w:numPr>
       </w:pPr>
       <w:r>
@@ -28905,8 +29499,8 @@
         <w:t xml:space="preserve">are static and temporal versions of the same product — consider one catalogue record (2 → 1)</w:t>
       </w:r>
     </w:p>
-    <w:bookmarkEnd w:id="104"/>
-    <w:bookmarkEnd w:id="105"/>
+    <w:bookmarkEnd w:id="113"/>
+    <w:bookmarkEnd w:id="114"/>
     <w:sectPr>
       <w:footnotePr>
         <w:numRestart w:val="eachSect"/>
@@ -29293,6 +29887,9 @@
     <w:abstractNumId w:val="991"/>
   </w:num>
   <w:num w:numId="1011">
+    <w:abstractNumId w:val="991"/>
+  </w:num>
+  <w:num w:numId="1012">
     <w:abstractNumId w:val="991"/>
   </w:num>
 </w:numbering>

</xml_diff>

<commit_message>
feat: add giscus comments and review participation tracking
- Enable GitHub Discussions; wire giscus into the HTML report
  (comments key in report.qmd) and the dashboard (footer embed in
  docs/index.html), both using the Announcements category
- Add data/review_log.json: audit trail of review events across all
  channels (form, GitHub, email, document), backfilled from issues
  #1-16 and the Alliance team's dashboard review of 8 July 2026
- Render a computed Review participation table in the report's
  Feedback and Review section (load_review_log in report_common.py)
- Document both mechanisms and the remaining manual step (giscus app
  install) in FEEDBACK.md
- Republish report artifacts (html/pdf/docx) to docs/

Co-Authored-By: Claude Fable 5 <noreply@anthropic.com>
</commit_message>
<xml_diff>
--- a/docs/report.docx
+++ b/docs/report.docx
@@ -23,7 +23,7 @@
         <w:pStyle w:val="Date"/>
       </w:pPr>
       <w:r>
-        <w:t xml:space="preserve">2026-06-30</w:t>
+        <w:t xml:space="preserve">2026-07-09</w:t>
       </w:r>
     </w:p>
     <w:sdt>
@@ -14324,7 +14324,7 @@
       </w:r>
     </w:p>
     <w:bookmarkEnd w:id="94"/>
-    <w:bookmarkStart w:id="109" w:name="feedback-and-review"/>
+    <w:bookmarkStart w:id="121" w:name="feedback-and-review"/>
     <w:p>
       <w:pPr>
         <w:pStyle w:val="Heading2"/>
@@ -14333,7 +14333,7 @@
         <w:t xml:space="preserve">Feedback and Review</w:t>
       </w:r>
     </w:p>
-    <w:bookmarkStart w:id="108" w:name="X981c30afc5d34005fa58438231531a13ce51028"/>
+    <w:bookmarkStart w:id="100" w:name="X981c30afc5d34005fa58438231531a13ce51028"/>
     <w:p>
       <w:pPr>
         <w:pStyle w:val="Heading3"/>
@@ -14455,6 +14455,618 @@
       </w:hyperlink>
       <w:r>
         <w:t xml:space="preserve">.</w:t>
+      </w:r>
+    </w:p>
+    <w:p>
+      <w:pPr>
+        <w:pStyle w:val="BodyText"/>
+      </w:pPr>
+      <w:r>
+        <w:t xml:space="preserve">The HTML edition of this report also carries a comment thread at the bottom of the page (GitHub login required), backed by the repository’s GitHub Discussions — handy for quick remarks that don’t warrant a full issue. The same thread is embedded in the interactive dashboard.</w:t>
+      </w:r>
+    </w:p>
+    <w:bookmarkEnd w:id="100"/>
+    <w:bookmarkStart w:id="120" w:name="review-participation"/>
+    <w:p>
+      <w:pPr>
+        <w:pStyle w:val="Heading3"/>
+      </w:pPr>
+      <w:r>
+        <w:t xml:space="preserve">Review participation</w:t>
+      </w:r>
+    </w:p>
+    <w:p>
+      <w:pPr>
+        <w:pStyle w:val="FirstParagraph"/>
+      </w:pPr>
+      <w:r>
+        <w:t xml:space="preserve">Review of this work is tracked as part of programme participation. To date:</w:t>
+      </w:r>
+      <w:r>
+        <w:t xml:space="preserve"> </w:t>
+      </w:r>
+      <w:r>
+        <w:rPr>
+          <w:b/>
+          <w:bCs/>
+        </w:rPr>
+        <w:t xml:space="preserve">5 reviewers</w:t>
+      </w:r>
+      <w:r>
+        <w:t xml:space="preserve"> </w:t>
+      </w:r>
+      <w:r>
+        <w:t xml:space="preserve">across</w:t>
+      </w:r>
+      <w:r>
+        <w:t xml:space="preserve"> </w:t>
+      </w:r>
+      <w:r>
+        <w:rPr>
+          <w:b/>
+          <w:bCs/>
+        </w:rPr>
+        <w:t xml:space="preserve">4 review events</w:t>
+      </w:r>
+      <w:r>
+        <w:t xml:space="preserve">, generating</w:t>
+      </w:r>
+      <w:r>
+        <w:t xml:space="preserve"> </w:t>
+      </w:r>
+      <w:r>
+        <w:rPr>
+          <w:b/>
+          <w:bCs/>
+        </w:rPr>
+        <w:t xml:space="preserve">14 tracked feedback items</w:t>
+      </w:r>
+      <w:r>
+        <w:t xml:space="preserve">. The log is maintained in</w:t>
+      </w:r>
+      <w:r>
+        <w:t xml:space="preserve"> </w:t>
+      </w:r>
+      <w:hyperlink r:id="rId101">
+        <w:r>
+          <w:rPr>
+            <w:rStyle w:val="VerbatimChar"/>
+          </w:rPr>
+          <w:t xml:space="preserve">data/review_log.json</w:t>
+        </w:r>
+      </w:hyperlink>
+      <w:r>
+        <w:t xml:space="preserve"> </w:t>
+      </w:r>
+      <w:r>
+        <w:t xml:space="preserve">and covers all channels (feedback form, GitHub, email, documents).</w:t>
+      </w:r>
+    </w:p>
+    <w:tbl>
+      <w:tblPr>
+        <w:tblStyle w:val="Table"/>
+        <w:tblW w:type="pct" w:w="5000"/>
+        <w:tblLayout w:type="fixed"/>
+        <w:tblLook w:firstRow="1" w:lastRow="0" w:firstColumn="0" w:lastColumn="0" w:noHBand="0" w:noVBand="0" w:val="0020"/>
+      </w:tblPr>
+      <w:tblGrid>
+        <w:gridCol w:w="1320"/>
+        <w:gridCol w:w="1320"/>
+        <w:gridCol w:w="1320"/>
+        <w:gridCol w:w="1320"/>
+        <w:gridCol w:w="1320"/>
+        <w:gridCol w:w="1320"/>
+      </w:tblGrid>
+      <w:tr>
+        <w:trPr>
+          <w:tblHeader w:val="on"/>
+        </w:trPr>
+        <w:tc>
+          <w:tcPr/>
+          <w:p>
+            <w:pPr>
+              <w:pStyle w:val="Compact"/>
+            </w:pPr>
+            <w:r>
+              <w:t xml:space="preserve">Date</w:t>
+            </w:r>
+          </w:p>
+        </w:tc>
+        <w:tc>
+          <w:tcPr/>
+          <w:p>
+            <w:pPr>
+              <w:pStyle w:val="Compact"/>
+            </w:pPr>
+            <w:r>
+              <w:t xml:space="preserve">Reviewer(s)</w:t>
+            </w:r>
+          </w:p>
+        </w:tc>
+        <w:tc>
+          <w:tcPr/>
+          <w:p>
+            <w:pPr>
+              <w:pStyle w:val="Compact"/>
+            </w:pPr>
+            <w:r>
+              <w:t xml:space="preserve">Affiliation</w:t>
+            </w:r>
+          </w:p>
+        </w:tc>
+        <w:tc>
+          <w:tcPr/>
+          <w:p>
+            <w:pPr>
+              <w:pStyle w:val="Compact"/>
+            </w:pPr>
+            <w:r>
+              <w:t xml:space="preserve">Channel</w:t>
+            </w:r>
+          </w:p>
+        </w:tc>
+        <w:tc>
+          <w:tcPr/>
+          <w:p>
+            <w:pPr>
+              <w:pStyle w:val="Compact"/>
+            </w:pPr>
+            <w:r>
+              <w:t xml:space="preserve">Scope</w:t>
+            </w:r>
+          </w:p>
+        </w:tc>
+        <w:tc>
+          <w:tcPr/>
+          <w:p>
+            <w:pPr>
+              <w:pStyle w:val="Compact"/>
+            </w:pPr>
+            <w:r>
+              <w:t xml:space="preserve">Feedback items</w:t>
+            </w:r>
+          </w:p>
+        </w:tc>
+      </w:tr>
+      <w:tr>
+        <w:tc>
+          <w:tcPr/>
+          <w:p>
+            <w:pPr>
+              <w:pStyle w:val="Compact"/>
+            </w:pPr>
+            <w:r>
+              <w:t xml:space="preserve">2026-06-17</w:t>
+            </w:r>
+          </w:p>
+        </w:tc>
+        <w:tc>
+          <w:tcPr/>
+          <w:p>
+            <w:pPr>
+              <w:pStyle w:val="Compact"/>
+            </w:pPr>
+            <w:r>
+              <w:t xml:space="preserve">Brayden Youngberg</w:t>
+            </w:r>
+          </w:p>
+        </w:tc>
+        <w:tc>
+          <w:tcPr/>
+          <w:p>
+            <w:pPr>
+              <w:pStyle w:val="Compact"/>
+            </w:pPr>
+            <w:r>
+              <w:t xml:space="preserve">Alliance of Bioversity International and CIAT</w:t>
+            </w:r>
+          </w:p>
+        </w:tc>
+        <w:tc>
+          <w:tcPr/>
+          <w:p>
+            <w:pPr>
+              <w:pStyle w:val="Compact"/>
+            </w:pPr>
+            <w:r>
+              <w:t xml:space="preserve">GitHub issue</w:t>
+            </w:r>
+          </w:p>
+        </w:tc>
+        <w:tc>
+          <w:tcPr/>
+          <w:p>
+            <w:pPr>
+              <w:pStyle w:val="Compact"/>
+            </w:pPr>
+            <w:r>
+              <w:t xml:space="preserve">Report</w:t>
+            </w:r>
+          </w:p>
+        </w:tc>
+        <w:tc>
+          <w:tcPr/>
+          <w:p>
+            <w:pPr>
+              <w:pStyle w:val="Compact"/>
+            </w:pPr>
+            <w:hyperlink r:id="rId102">
+              <w:r>
+                <w:rPr>
+                  <w:rStyle w:val="Hyperlink"/>
+                </w:rPr>
+                <w:t xml:space="preserve">#1</w:t>
+              </w:r>
+            </w:hyperlink>
+          </w:p>
+        </w:tc>
+      </w:tr>
+      <w:tr>
+        <w:tc>
+          <w:tcPr/>
+          <w:p>
+            <w:pPr>
+              <w:pStyle w:val="Compact"/>
+            </w:pPr>
+            <w:r>
+              <w:t xml:space="preserve">2026-06-18</w:t>
+            </w:r>
+          </w:p>
+        </w:tc>
+        <w:tc>
+          <w:tcPr/>
+          <w:p>
+            <w:pPr>
+              <w:pStyle w:val="Compact"/>
+            </w:pPr>
+            <w:r>
+              <w:t xml:space="preserve">Brayden Youngberg</w:t>
+            </w:r>
+          </w:p>
+        </w:tc>
+        <w:tc>
+          <w:tcPr/>
+          <w:p>
+            <w:pPr>
+              <w:pStyle w:val="Compact"/>
+            </w:pPr>
+            <w:r>
+              <w:t xml:space="preserve">Alliance of Bioversity International and CIAT</w:t>
+            </w:r>
+          </w:p>
+        </w:tc>
+        <w:tc>
+          <w:tcPr/>
+          <w:p>
+            <w:pPr>
+              <w:pStyle w:val="Compact"/>
+            </w:pPr>
+            <w:r>
+              <w:t xml:space="preserve">GitHub issue</w:t>
+            </w:r>
+          </w:p>
+        </w:tc>
+        <w:tc>
+          <w:tcPr/>
+          <w:p>
+            <w:pPr>
+              <w:pStyle w:val="Compact"/>
+            </w:pPr>
+            <w:r>
+              <w:t xml:space="preserve">Report</w:t>
+            </w:r>
+          </w:p>
+        </w:tc>
+        <w:tc>
+          <w:tcPr/>
+          <w:p>
+            <w:pPr>
+              <w:pStyle w:val="Compact"/>
+            </w:pPr>
+            <w:hyperlink r:id="rId103">
+              <w:r>
+                <w:rPr>
+                  <w:rStyle w:val="Hyperlink"/>
+                </w:rPr>
+                <w:t xml:space="preserve">#4</w:t>
+              </w:r>
+            </w:hyperlink>
+          </w:p>
+        </w:tc>
+      </w:tr>
+      <w:tr>
+        <w:tc>
+          <w:tcPr/>
+          <w:p>
+            <w:pPr>
+              <w:pStyle w:val="Compact"/>
+            </w:pPr>
+            <w:r>
+              <w:t xml:space="preserve">2026-06-29</w:t>
+            </w:r>
+          </w:p>
+        </w:tc>
+        <w:tc>
+          <w:tcPr/>
+          <w:p>
+            <w:pPr>
+              <w:pStyle w:val="Compact"/>
+            </w:pPr>
+            <w:r>
+              <w:t xml:space="preserve">Michelle Tigchelaar</w:t>
+            </w:r>
+          </w:p>
+        </w:tc>
+        <w:tc>
+          <w:tcPr/>
+          <w:p>
+            <w:pPr>
+              <w:pStyle w:val="Compact"/>
+            </w:pPr>
+            <w:r>
+              <w:t xml:space="preserve">Stanford University</w:t>
+            </w:r>
+          </w:p>
+        </w:tc>
+        <w:tc>
+          <w:tcPr/>
+          <w:p>
+            <w:pPr>
+              <w:pStyle w:val="Compact"/>
+            </w:pPr>
+            <w:r>
+              <w:t xml:space="preserve">GitHub issue</w:t>
+            </w:r>
+          </w:p>
+        </w:tc>
+        <w:tc>
+          <w:tcPr/>
+          <w:p>
+            <w:pPr>
+              <w:pStyle w:val="Compact"/>
+            </w:pPr>
+            <w:r>
+              <w:t xml:space="preserve">Report</w:t>
+            </w:r>
+          </w:p>
+        </w:tc>
+        <w:tc>
+          <w:tcPr/>
+          <w:p>
+            <w:pPr>
+              <w:pStyle w:val="Compact"/>
+            </w:pPr>
+            <w:hyperlink r:id="rId104">
+              <w:r>
+                <w:rPr>
+                  <w:rStyle w:val="Hyperlink"/>
+                </w:rPr>
+                <w:t xml:space="preserve">#5</w:t>
+              </w:r>
+            </w:hyperlink>
+            <w:r>
+              <w:t xml:space="preserve">,</w:t>
+            </w:r>
+            <w:r>
+              <w:t xml:space="preserve"> </w:t>
+            </w:r>
+            <w:hyperlink r:id="rId105">
+              <w:r>
+                <w:rPr>
+                  <w:rStyle w:val="Hyperlink"/>
+                </w:rPr>
+                <w:t xml:space="preserve">#6</w:t>
+              </w:r>
+            </w:hyperlink>
+          </w:p>
+        </w:tc>
+      </w:tr>
+      <w:tr>
+        <w:tc>
+          <w:tcPr/>
+          <w:p>
+            <w:pPr>
+              <w:pStyle w:val="Compact"/>
+            </w:pPr>
+            <w:r>
+              <w:t xml:space="preserve">2026-07-08</w:t>
+            </w:r>
+          </w:p>
+        </w:tc>
+        <w:tc>
+          <w:tcPr/>
+          <w:p>
+            <w:pPr>
+              <w:pStyle w:val="Compact"/>
+            </w:pPr>
+            <w:r>
+              <w:t xml:space="preserve">Alcade Segnon, Franck Tonle, Robert Zougmore</w:t>
+            </w:r>
+          </w:p>
+        </w:tc>
+        <w:tc>
+          <w:tcPr/>
+          <w:p>
+            <w:pPr>
+              <w:pStyle w:val="Compact"/>
+            </w:pPr>
+            <w:r>
+              <w:t xml:space="preserve">Alliance of Bioversity International and CIAT</w:t>
+            </w:r>
+          </w:p>
+        </w:tc>
+        <w:tc>
+          <w:tcPr/>
+          <w:p>
+            <w:pPr>
+              <w:pStyle w:val="Compact"/>
+            </w:pPr>
+            <w:r>
+              <w:t xml:space="preserve">Email + PDF document</w:t>
+            </w:r>
+          </w:p>
+        </w:tc>
+        <w:tc>
+          <w:tcPr/>
+          <w:p>
+            <w:pPr>
+              <w:pStyle w:val="Compact"/>
+            </w:pPr>
+            <w:r>
+              <w:t xml:space="preserve">Dashboard</w:t>
+            </w:r>
+          </w:p>
+        </w:tc>
+        <w:tc>
+          <w:tcPr/>
+          <w:p>
+            <w:pPr>
+              <w:pStyle w:val="Compact"/>
+            </w:pPr>
+            <w:hyperlink r:id="rId106">
+              <w:r>
+                <w:rPr>
+                  <w:rStyle w:val="Hyperlink"/>
+                </w:rPr>
+                <w:t xml:space="preserve">#7</w:t>
+              </w:r>
+            </w:hyperlink>
+            <w:r>
+              <w:t xml:space="preserve">,</w:t>
+            </w:r>
+            <w:r>
+              <w:t xml:space="preserve"> </w:t>
+            </w:r>
+            <w:hyperlink r:id="rId107">
+              <w:r>
+                <w:rPr>
+                  <w:rStyle w:val="Hyperlink"/>
+                </w:rPr>
+                <w:t xml:space="preserve">#8</w:t>
+              </w:r>
+            </w:hyperlink>
+            <w:r>
+              <w:t xml:space="preserve">,</w:t>
+            </w:r>
+            <w:r>
+              <w:t xml:space="preserve"> </w:t>
+            </w:r>
+            <w:hyperlink r:id="rId108">
+              <w:r>
+                <w:rPr>
+                  <w:rStyle w:val="Hyperlink"/>
+                </w:rPr>
+                <w:t xml:space="preserve">#9</w:t>
+              </w:r>
+            </w:hyperlink>
+            <w:r>
+              <w:t xml:space="preserve">,</w:t>
+            </w:r>
+            <w:r>
+              <w:t xml:space="preserve"> </w:t>
+            </w:r>
+            <w:hyperlink r:id="rId109">
+              <w:r>
+                <w:rPr>
+                  <w:rStyle w:val="Hyperlink"/>
+                </w:rPr>
+                <w:t xml:space="preserve">#10</w:t>
+              </w:r>
+            </w:hyperlink>
+            <w:r>
+              <w:t xml:space="preserve">,</w:t>
+            </w:r>
+            <w:r>
+              <w:t xml:space="preserve"> </w:t>
+            </w:r>
+            <w:hyperlink r:id="rId110">
+              <w:r>
+                <w:rPr>
+                  <w:rStyle w:val="Hyperlink"/>
+                </w:rPr>
+                <w:t xml:space="preserve">#11</w:t>
+              </w:r>
+            </w:hyperlink>
+            <w:r>
+              <w:t xml:space="preserve">,</w:t>
+            </w:r>
+            <w:r>
+              <w:t xml:space="preserve"> </w:t>
+            </w:r>
+            <w:hyperlink r:id="rId111">
+              <w:r>
+                <w:rPr>
+                  <w:rStyle w:val="Hyperlink"/>
+                </w:rPr>
+                <w:t xml:space="preserve">#12</w:t>
+              </w:r>
+            </w:hyperlink>
+            <w:r>
+              <w:t xml:space="preserve">,</w:t>
+            </w:r>
+            <w:r>
+              <w:t xml:space="preserve"> </w:t>
+            </w:r>
+            <w:hyperlink r:id="rId112">
+              <w:r>
+                <w:rPr>
+                  <w:rStyle w:val="Hyperlink"/>
+                </w:rPr>
+                <w:t xml:space="preserve">#13</w:t>
+              </w:r>
+            </w:hyperlink>
+            <w:r>
+              <w:t xml:space="preserve">,</w:t>
+            </w:r>
+            <w:r>
+              <w:t xml:space="preserve"> </w:t>
+            </w:r>
+            <w:hyperlink r:id="rId113">
+              <w:r>
+                <w:rPr>
+                  <w:rStyle w:val="Hyperlink"/>
+                </w:rPr>
+                <w:t xml:space="preserve">#14</w:t>
+              </w:r>
+            </w:hyperlink>
+            <w:r>
+              <w:t xml:space="preserve">,</w:t>
+            </w:r>
+            <w:r>
+              <w:t xml:space="preserve"> </w:t>
+            </w:r>
+            <w:hyperlink r:id="rId114">
+              <w:r>
+                <w:rPr>
+                  <w:rStyle w:val="Hyperlink"/>
+                </w:rPr>
+                <w:t xml:space="preserve">#15</w:t>
+              </w:r>
+            </w:hyperlink>
+            <w:r>
+              <w:t xml:space="preserve">,</w:t>
+            </w:r>
+            <w:r>
+              <w:t xml:space="preserve"> </w:t>
+            </w:r>
+            <w:hyperlink r:id="rId115">
+              <w:r>
+                <w:rPr>
+                  <w:rStyle w:val="Hyperlink"/>
+                </w:rPr>
+                <w:t xml:space="preserve">#16</w:t>
+              </w:r>
+            </w:hyperlink>
+          </w:p>
+        </w:tc>
+      </w:tr>
+    </w:tbl>
+    <w:p>
+      <w:pPr>
+        <w:pStyle w:val="BodyText"/>
+      </w:pPr>
+      <w:r>
+        <w:t xml:space="preserve"> </w:t>
       </w:r>
     </w:p>
     <w:tbl>
@@ -14497,18 +15109,18 @@
                 <wp:inline>
                   <wp:extent cx="152400" cy="152400"/>
                   <wp:effectExtent b="0" l="0" r="0" t="0"/>
-                  <wp:docPr descr="" title="" id="101" name="Picture"/>
+                  <wp:docPr descr="" title="" id="117" name="Picture"/>
                   <a:graphic>
                     <a:graphicData uri="http://schemas.openxmlformats.org/drawingml/2006/picture">
                       <pic:pic>
                         <pic:nvPicPr>
-                          <pic:cNvPr descr="/Applications/quarto/share/formats/docx/note.png" id="102" name="Picture"/>
+                          <pic:cNvPr descr="/Applications/quarto/share/formats/docx/note.png" id="118" name="Picture"/>
                           <pic:cNvPicPr>
                             <a:picLocks noChangeArrowheads="1" noChangeAspect="1"/>
                           </pic:cNvPicPr>
                         </pic:nvPicPr>
                         <pic:blipFill>
-                          <a:blip r:embed="rId100"/>
+                          <a:blip r:embed="rId116"/>
                           <a:stretch>
                             <a:fillRect/>
                           </a:stretch>
@@ -14627,7 +15239,7 @@
             <w:r>
               <w:t xml:space="preserve">— targeted gap-filling outreach and a broader prioritisation approach that does not treat current top-three nominations as the only candidates for Phase 1 review (</w:t>
             </w:r>
-            <w:hyperlink r:id="rId103">
+            <w:hyperlink r:id="rId104">
               <w:r>
                 <w:rPr>
                   <w:rStyle w:val="Hyperlink"/>
@@ -14641,7 +15253,7 @@
             <w:r>
               <w:t xml:space="preserve"> </w:t>
             </w:r>
-            <w:hyperlink r:id="rId104">
+            <w:hyperlink r:id="rId105">
               <w:r>
                 <w:rPr>
                   <w:rStyle w:val="Hyperlink"/>
@@ -14674,7 +15286,7 @@
             <w:r>
               <w:t xml:space="preserve">— complement this catalogue of assets produced with evidence on which climate datasets, boundaries, and crop or land-use maps people actually use across CGIAR (</w:t>
             </w:r>
-            <w:hyperlink r:id="rId105">
+            <w:hyperlink r:id="rId103">
               <w:r>
                 <w:rPr>
                   <w:rStyle w:val="Hyperlink"/>
@@ -14707,7 +15319,7 @@
             <w:r>
               <w:t xml:space="preserve">— clarify governance for inclusion decisions, consider whether restricted-access assets should receive lower near-term priority, and distinguish underlying datasets from tools or catalogues (</w:t>
             </w:r>
-            <w:hyperlink r:id="rId106">
+            <w:hyperlink r:id="rId102">
               <w:r>
                 <w:rPr>
                   <w:rStyle w:val="Hyperlink"/>
@@ -14732,7 +15344,7 @@
             <w:r>
               <w:t xml:space="preserve"> </w:t>
             </w:r>
-            <w:hyperlink r:id="rId107">
+            <w:hyperlink r:id="rId119">
               <w:r>
                 <w:rPr>
                   <w:rStyle w:val="Hyperlink"/>
@@ -14749,7 +15361,7 @@
             <w:r>
               <w:t xml:space="preserve"> </w:t>
             </w:r>
-            <w:hyperlink r:id="rId104">
+            <w:hyperlink r:id="rId105">
               <w:r>
                 <w:rPr>
                   <w:rStyle w:val="Hyperlink"/>
@@ -14763,7 +15375,7 @@
             <w:r>
               <w:t xml:space="preserve"> </w:t>
             </w:r>
-            <w:hyperlink r:id="rId103">
+            <w:hyperlink r:id="rId104">
               <w:r>
                 <w:rPr>
                   <w:rStyle w:val="Hyperlink"/>
@@ -14777,7 +15389,7 @@
             <w:r>
               <w:t xml:space="preserve"> </w:t>
             </w:r>
-            <w:hyperlink r:id="rId105">
+            <w:hyperlink r:id="rId103">
               <w:r>
                 <w:rPr>
                   <w:rStyle w:val="Hyperlink"/>
@@ -14791,7 +15403,7 @@
             <w:r>
               <w:t xml:space="preserve"> </w:t>
             </w:r>
-            <w:hyperlink r:id="rId106">
+            <w:hyperlink r:id="rId102">
               <w:r>
                 <w:rPr>
                   <w:rStyle w:val="Hyperlink"/>
@@ -14813,9 +15425,9 @@
         </w:pict>
       </w:r>
     </w:p>
-    <w:bookmarkEnd w:id="108"/>
-    <w:bookmarkEnd w:id="109"/>
-    <w:bookmarkStart w:id="110" w:name="annex-a"/>
+    <w:bookmarkEnd w:id="120"/>
+    <w:bookmarkEnd w:id="121"/>
+    <w:bookmarkStart w:id="122" w:name="annex-a"/>
     <w:p>
       <w:pPr>
         <w:pStyle w:val="Heading2"/>
@@ -28512,8 +29124,8 @@
         </w:pict>
       </w:r>
     </w:p>
-    <w:bookmarkEnd w:id="110"/>
-    <w:bookmarkStart w:id="111" w:name="annex-b"/>
+    <w:bookmarkEnd w:id="122"/>
+    <w:bookmarkStart w:id="123" w:name="annex-b"/>
     <w:p>
       <w:pPr>
         <w:pStyle w:val="Heading2"/>
@@ -29097,8 +29709,8 @@
         </w:pict>
       </w:r>
     </w:p>
-    <w:bookmarkEnd w:id="111"/>
-    <w:bookmarkStart w:id="114" w:name="annex-c"/>
+    <w:bookmarkEnd w:id="123"/>
+    <w:bookmarkStart w:id="126" w:name="annex-c"/>
     <w:p>
       <w:pPr>
         <w:pStyle w:val="Heading2"/>
@@ -29107,7 +29719,7 @@
         <w:t xml:space="preserve">Annex C — Merge log</w:t>
       </w:r>
     </w:p>
-    <w:bookmarkStart w:id="112" w:name="c.1-applied-consolidations"/>
+    <w:bookmarkStart w:id="124" w:name="c.1-applied-consolidations"/>
     <w:p>
       <w:pPr>
         <w:pStyle w:val="Heading3"/>
@@ -29419,8 +30031,8 @@
         </w:tc>
       </w:tr>
     </w:tbl>
-    <w:bookmarkEnd w:id="112"/>
-    <w:bookmarkStart w:id="113" w:name="c.2-recommended-for-catalogue"/>
+    <w:bookmarkEnd w:id="124"/>
+    <w:bookmarkStart w:id="125" w:name="c.2-recommended-for-catalogue"/>
     <w:p>
       <w:pPr>
         <w:pStyle w:val="Heading3"/>
@@ -29499,8 +30111,8 @@
         <w:t xml:space="preserve">are static and temporal versions of the same product — consider one catalogue record (2 → 1)</w:t>
       </w:r>
     </w:p>
-    <w:bookmarkEnd w:id="113"/>
-    <w:bookmarkEnd w:id="114"/>
+    <w:bookmarkEnd w:id="125"/>
+    <w:bookmarkEnd w:id="126"/>
     <w:sectPr>
       <w:footnotePr>
         <w:numRestart w:val="eachSect"/>

</xml_diff>

<commit_message>
docs: bump report to 1.1.0-draft; refresh review-themes note
Version was still 1.0.1-draft despite the review-participation section,
the comment threads, the display-name corrections, and three waves of
dashboard fixes landing since. Version string now lives once in
report_common.py (REPORT_VERSION) and both the Quarto header line and
the markdown export read it. Review-themes callout updated to 9 July
and records the Alliance dashboard review outcome (8 fixed, #12/#13
open pending centre outreach). Artifacts re-rendered and republished.

Co-Authored-By: Claude Fable 5 <noreply@anthropic.com>
</commit_message>
<xml_diff>
--- a/docs/report.docx
+++ b/docs/report.docx
@@ -61,7 +61,7 @@
           <w:b/>
           <w:bCs/>
         </w:rPr>
-        <w:t xml:space="preserve">Version 1.0.1 (draft)</w:t>
+        <w:t xml:space="preserve">Version 1.1.0-draft</w:t>
       </w:r>
       <w:r>
         <w:t xml:space="preserve"> </w:t>
@@ -15176,7 +15176,7 @@
                 <w:i/>
                 <w:iCs/>
               </w:rPr>
-              <w:t xml:space="preserve">Last updated: 30 June 2026.</w:t>
+              <w:t xml:space="preserve">Last updated: 9 July 2026.</w:t>
             </w:r>
             <w:r>
               <w:t xml:space="preserve"> </w:t>
@@ -15216,6 +15216,53 @@
             </w:r>
             <w:r>
               <w:t xml:space="preserve">(Next Steps).</w:t>
+            </w:r>
+          </w:p>
+          <w:p>
+            <w:pPr>
+              <w:pStyle w:val="Compact"/>
+              <w:numPr>
+                <w:ilvl w:val="0"/>
+                <w:numId w:val="1011"/>
+              </w:numPr>
+            </w:pPr>
+            <w:r>
+              <w:rPr>
+                <w:b/>
+                <w:bCs/>
+              </w:rPr>
+              <w:t xml:space="preserve">Resolved</w:t>
+            </w:r>
+            <w:r>
+              <w:t xml:space="preserve"> </w:t>
+            </w:r>
+            <w:r>
+              <w:t xml:space="preserve">— the Alliance team’s systematic dashboard review (8 July 2026) logged ten issues covering navigation, filter consistency, coverage-map totals, responsiveness, and accessibility; eight are fixed and closed, and two data-completeness items (missing data links, unconfirmed contact emails) remain open pending centre outreach (</w:t>
+            </w:r>
+            <w:hyperlink r:id="rId111">
+              <w:r>
+                <w:rPr>
+                  <w:rStyle w:val="Hyperlink"/>
+                </w:rPr>
+                <w:t xml:space="preserve">#12</w:t>
+              </w:r>
+            </w:hyperlink>
+            <w:r>
+              <w:t xml:space="preserve">,</w:t>
+            </w:r>
+            <w:r>
+              <w:t xml:space="preserve"> </w:t>
+            </w:r>
+            <w:hyperlink r:id="rId112">
+              <w:r>
+                <w:rPr>
+                  <w:rStyle w:val="Hyperlink"/>
+                </w:rPr>
+                <w:t xml:space="preserve">#13</w:t>
+              </w:r>
+            </w:hyperlink>
+            <w:r>
+              <w:t xml:space="preserve">).</w:t>
             </w:r>
           </w:p>
           <w:p>

</xml_diff>